<commit_message>
Added ref materials excluded secrets etc
</commit_message>
<xml_diff>
--- a/week4/Day23/FAQ.docx
+++ b/week4/Day23/FAQ.docx
@@ -1,6 +1,6 @@
 
 <file path=word/document.xml><?xml version="1.0" encoding="utf-8"?>
-<w:document xmlns:wpc="http://schemas.microsoft.com/office/word/2010/wordprocessingCanvas" xmlns:cx="http://schemas.microsoft.com/office/drawing/2014/chartex" xmlns:cx1="http://schemas.microsoft.com/office/drawing/2015/9/8/chartex" xmlns:cx2="http://schemas.microsoft.com/office/drawing/2015/10/21/chartex" xmlns:cx3="http://schemas.microsoft.com/office/drawing/2016/5/9/chartex" xmlns:cx4="http://schemas.microsoft.com/office/drawing/2016/5/10/chartex" xmlns:cx5="http://schemas.microsoft.com/office/drawing/2016/5/11/chartex" xmlns:cx6="http://schemas.microsoft.com/office/drawing/2016/5/12/chartex" xmlns:cx7="http://schemas.microsoft.com/office/drawing/2016/5/13/chartex" xmlns:cx8="http://schemas.microsoft.com/office/drawing/2016/5/14/chartex" xmlns:mc="http://schemas.openxmlformats.org/markup-compatibility/2006" xmlns:aink="http://schemas.microsoft.com/office/drawing/2016/ink" xmlns:am3d="http://schemas.microsoft.com/office/drawing/2017/model3d" xmlns:o="urn:schemas-microsoft-com:office:office" xmlns:oel="http://schemas.microsoft.com/office/2019/extlst" xmlns:r="http://schemas.openxmlformats.org/officeDocument/2006/relationships" xmlns:m="http://schemas.openxmlformats.org/officeDocument/2006/math" xmlns:v="urn:schemas-microsoft-com:vml" xmlns:wp14="http://schemas.microsoft.com/office/word/2010/wordprocessingDrawing" xmlns:wp="http://schemas.openxmlformats.org/drawingml/2006/wordprocessingDrawing" xmlns:w10="urn:schemas-microsoft-com:office:word" xmlns:w="http://schemas.openxmlformats.org/wordprocessingml/2006/main" xmlns:w14="http://schemas.microsoft.com/office/word/2010/wordml" xmlns:w15="http://schemas.microsoft.com/office/word/2012/wordml" xmlns:w16cex="http://schemas.microsoft.com/office/word/2018/wordml/cex" xmlns:w16cid="http://schemas.microsoft.com/office/word/2016/wordml/cid" xmlns:w16="http://schemas.microsoft.com/office/word/2018/wordml" xmlns:w16du="http://schemas.microsoft.com/office/word/2023/wordml/word16du" xmlns:w16sdtdh="http://schemas.microsoft.com/office/word/2020/wordml/sdtdatahash" xmlns:w16sdtfl="http://schemas.microsoft.com/office/word/2024/wordml/sdtformatlock" xmlns:w16se="http://schemas.microsoft.com/office/word/2015/wordml/symex" xmlns:wpg="http://schemas.microsoft.com/office/word/2010/wordprocessingGroup" xmlns:wpi="http://schemas.microsoft.com/office/word/2010/wordprocessingInk" xmlns:wne="http://schemas.microsoft.com/office/word/2006/wordml" xmlns:wps="http://schemas.microsoft.com/office/word/2010/wordprocessingShape" mc:Ignorable="w14 w15 w16se w16cid w16 w16cex w16sdtdh w16sdtfl w16du wp14">
+<w:document xmlns:wpc="http://schemas.microsoft.com/office/word/2010/wordprocessingCanvas" xmlns:cx="http://schemas.microsoft.com/office/drawing/2014/chartex" xmlns:cx1="http://schemas.microsoft.com/office/drawing/2015/9/8/chartex" xmlns:cx2="http://schemas.microsoft.com/office/drawing/2015/10/21/chartex" xmlns:cx3="http://schemas.microsoft.com/office/drawing/2016/5/9/chartex" xmlns:cx4="http://schemas.microsoft.com/office/drawing/2016/5/10/chartex" xmlns:cx5="http://schemas.microsoft.com/office/drawing/2016/5/11/chartex" xmlns:cx6="http://schemas.microsoft.com/office/drawing/2016/5/12/chartex" xmlns:cx7="http://schemas.microsoft.com/office/drawing/2016/5/13/chartex" xmlns:cx8="http://schemas.microsoft.com/office/drawing/2016/5/14/chartex" xmlns:mc="http://schemas.openxmlformats.org/markup-compatibility/2006" xmlns:aink="http://schemas.microsoft.com/office/drawing/2016/ink" xmlns:am3d="http://schemas.microsoft.com/office/drawing/2017/model3d" xmlns:o="urn:schemas-microsoft-com:office:office" xmlns:oel="http://schemas.microsoft.com/office/2019/extlst" xmlns:r="http://schemas.openxmlformats.org/officeDocument/2006/relationships" xmlns:m="http://schemas.openxmlformats.org/officeDocument/2006/math" xmlns:v="urn:schemas-microsoft-com:vml" xmlns:wp14="http://schemas.microsoft.com/office/word/2010/wordprocessingDrawing" xmlns:wp="http://schemas.openxmlformats.org/drawingml/2006/wordprocessingDrawing" xmlns:w10="urn:schemas-microsoft-com:office:word" xmlns:w="http://schemas.openxmlformats.org/wordprocessingml/2006/main" xmlns:w14="http://schemas.microsoft.com/office/word/2010/wordml" xmlns:w15="http://schemas.microsoft.com/office/word/2012/wordml" xmlns:w16cei="http://schemas.microsoft.com/office/word/2026/wordml/cei" xmlns:w16cex="http://schemas.microsoft.com/office/word/2018/wordml/cex" xmlns:w16cid="http://schemas.microsoft.com/office/word/2016/wordml/cid" xmlns:w16="http://schemas.microsoft.com/office/word/2018/wordml" xmlns:w16du="http://schemas.microsoft.com/office/word/2023/wordml/word16du" xmlns:w16sdtdh="http://schemas.microsoft.com/office/word/2020/wordml/sdtdatahash" xmlns:w16sdtfl="http://schemas.microsoft.com/office/word/2024/wordml/sdtformatlock" xmlns:w16se="http://schemas.microsoft.com/office/word/2015/wordml/symex" xmlns:wpg="http://schemas.microsoft.com/office/word/2010/wordprocessingGroup" xmlns:wpi="http://schemas.microsoft.com/office/word/2010/wordprocessingInk" xmlns:wne="http://schemas.microsoft.com/office/word/2006/wordml" xmlns:wps="http://schemas.microsoft.com/office/word/2010/wordprocessingShape" mc:Ignorable="w14 w15 w16se w16cid w16 w16cex w16sdtdh w16sdtfl w16du wp14">
   <w:body>
     <w:p>
       <w:pPr>
@@ -29,34 +29,12 @@
         <w:rPr>
           <w:rStyle w:val="IntenseEmphasis"/>
         </w:rPr>
-        <w:t xml:space="preserve">Can </w:t>
-      </w:r>
-      <w:proofErr w:type="spellStart"/>
-      <w:r>
-        <w:rPr>
-          <w:rStyle w:val="IntenseEmphasis"/>
-        </w:rPr>
-        <w:t>LiteLLM</w:t>
-      </w:r>
-      <w:proofErr w:type="spellEnd"/>
-      <w:r>
-        <w:rPr>
-          <w:rStyle w:val="IntenseEmphasis"/>
-        </w:rPr>
-        <w:t xml:space="preserve"> dynamically route to any underlying LLM/model, or does it have to be always statically bound? If dynamic possible, how can it be done in N8N?</w:t>
-      </w:r>
-    </w:p>
-    <w:p>
-      <w:r>
-        <w:t xml:space="preserve">Yes, </w:t>
-      </w:r>
-      <w:proofErr w:type="spellStart"/>
-      <w:r>
-        <w:t>LiteLLM</w:t>
-      </w:r>
-      <w:proofErr w:type="spellEnd"/>
-      <w:r>
-        <w:t xml:space="preserve"> is </w:t>
+        <w:t>Can LiteLLM dynamically route to any underlying LLM/model, or does it have to be always statically bound? If dynamic possible, how can it be done in N8N?</w:t>
+      </w:r>
+    </w:p>
+    <w:p>
+      <w:r>
+        <w:t xml:space="preserve">Yes, LiteLLM is </w:t>
       </w:r>
       <w:r>
         <w:rPr>
@@ -71,20 +49,7 @@
     </w:p>
     <w:p>
       <w:r>
-        <w:t xml:space="preserve">Think of your </w:t>
-      </w:r>
-      <w:proofErr w:type="spellStart"/>
-      <w:r>
-        <w:t>litellm_</w:t>
-      </w:r>
-      <w:proofErr w:type="gramStart"/>
-      <w:r>
-        <w:t>config.yaml</w:t>
-      </w:r>
-      <w:proofErr w:type="spellEnd"/>
-      <w:proofErr w:type="gramEnd"/>
-      <w:r>
-        <w:t xml:space="preserve"> as a </w:t>
+        <w:t xml:space="preserve">Think of your litellm_config.yaml as a </w:t>
       </w:r>
       <w:r>
         <w:rPr>
@@ -99,39 +64,7 @@
     </w:p>
     <w:p>
       <w:r>
-        <w:t xml:space="preserve">When n8n sends a request to </w:t>
-      </w:r>
-      <w:proofErr w:type="spellStart"/>
-      <w:r>
-        <w:t>LiteLLM</w:t>
-      </w:r>
-      <w:proofErr w:type="spellEnd"/>
-      <w:r>
-        <w:t xml:space="preserve">, it includes a model parameter in the JSON payload. </w:t>
-      </w:r>
-      <w:proofErr w:type="spellStart"/>
-      <w:r>
-        <w:t>LiteLLM</w:t>
-      </w:r>
-      <w:proofErr w:type="spellEnd"/>
-      <w:r>
-        <w:t xml:space="preserve"> reads that parameter, looks it up in your YAML file, and instantly routes the request to the correct provider (</w:t>
-      </w:r>
-      <w:proofErr w:type="spellStart"/>
-      <w:r>
-        <w:t>Ollama</w:t>
-      </w:r>
-      <w:proofErr w:type="spellEnd"/>
-      <w:r>
-        <w:t xml:space="preserve">, </w:t>
-      </w:r>
-      <w:proofErr w:type="spellStart"/>
-      <w:r>
-        <w:t>Groq</w:t>
-      </w:r>
-      <w:proofErr w:type="spellEnd"/>
-      <w:r>
-        <w:t>, OpenAI, etc.) using the appropriate API keys you configured.</w:t>
+        <w:t>When n8n sends a request to LiteLLM, it includes a model parameter in the JSON payload. LiteLLM reads that parameter, looks it up in your YAML file, and instantly routes the request to the correct provider (Ollama, Groq, OpenAI, etc.) using the appropriate API keys you configured.</w:t>
       </w:r>
     </w:p>
     <w:p>
@@ -156,15 +89,7 @@
     </w:p>
     <w:p>
       <w:r>
-        <w:t xml:space="preserve">Because </w:t>
-      </w:r>
-      <w:proofErr w:type="spellStart"/>
-      <w:r>
-        <w:t>LiteLLM</w:t>
-      </w:r>
-      <w:proofErr w:type="spellEnd"/>
-      <w:r>
-        <w:t xml:space="preserve"> perfectly mimics the OpenAI API format, you will use n8n's standard </w:t>
+        <w:t xml:space="preserve">Because LiteLLM perfectly mimics the OpenAI API format, you will use n8n's standard </w:t>
       </w:r>
       <w:r>
         <w:rPr>
@@ -237,15 +162,7 @@
         <w:t>Base URL</w:t>
       </w:r>
       <w:r>
-        <w:t xml:space="preserve"> to point to your </w:t>
-      </w:r>
-      <w:proofErr w:type="spellStart"/>
-      <w:r>
-        <w:t>LiteLLM</w:t>
-      </w:r>
-      <w:proofErr w:type="spellEnd"/>
-      <w:r>
-        <w:t xml:space="preserve"> proxy. Since they are in the same Docker network, this should be http://litellm_proxy:4000/v1 (the /v1 is required for OpenAI compatibility).</w:t>
+        <w:t xml:space="preserve"> to point to your LiteLLM proxy. Since they are in the same Docker network, this should be http://litellm_proxy:4000/v1 (the /v1 is required for OpenAI compatibility).</w:t>
       </w:r>
     </w:p>
     <w:p>
@@ -266,23 +183,7 @@
         <w:t>API Key</w:t>
       </w:r>
       <w:r>
-        <w:t xml:space="preserve">, type </w:t>
-      </w:r>
-      <w:proofErr w:type="spellStart"/>
-      <w:r>
-        <w:t>sk</w:t>
-      </w:r>
-      <w:proofErr w:type="spellEnd"/>
-      <w:r>
-        <w:t>-dummy (</w:t>
-      </w:r>
-      <w:proofErr w:type="spellStart"/>
-      <w:r>
-        <w:t>LiteLLM</w:t>
-      </w:r>
-      <w:proofErr w:type="spellEnd"/>
-      <w:r>
-        <w:t xml:space="preserve"> requires something here, even if it ignores it).</w:t>
+        <w:t>, type sk-dummy (LiteLLM requires something here, even if it ignores it).</w:t>
       </w:r>
     </w:p>
     <w:p>
@@ -355,28 +256,7 @@
         </w:numPr>
       </w:pPr>
       <w:r>
-        <w:t xml:space="preserve">Type the exact </w:t>
-      </w:r>
-      <w:proofErr w:type="spellStart"/>
-      <w:r>
-        <w:t>model_name</w:t>
-      </w:r>
-      <w:proofErr w:type="spellEnd"/>
-      <w:r>
-        <w:t xml:space="preserve"> you defined in your </w:t>
-      </w:r>
-      <w:proofErr w:type="spellStart"/>
-      <w:r>
-        <w:t>litellm_</w:t>
-      </w:r>
-      <w:proofErr w:type="gramStart"/>
-      <w:r>
-        <w:t>config.yaml</w:t>
-      </w:r>
-      <w:proofErr w:type="spellEnd"/>
-      <w:proofErr w:type="gramEnd"/>
-      <w:r>
-        <w:t>.</w:t>
+        <w:t>Type the exact model_name you defined in your litellm_config.yaml.</w:t>
       </w:r>
     </w:p>
     <w:p>
@@ -391,13 +271,8 @@
           <w:numId w:val="3"/>
         </w:numPr>
       </w:pPr>
-      <w:proofErr w:type="spellStart"/>
-      <w:r>
-        <w:t>groq</w:t>
-      </w:r>
-      <w:proofErr w:type="spellEnd"/>
-      <w:r>
-        <w:t>/llama-3.3-70b-versatile</w:t>
+      <w:r>
+        <w:t>groq/llama-3.3-70b-versatile</w:t>
       </w:r>
     </w:p>
     <w:p>
@@ -407,13 +282,8 @@
           <w:numId w:val="3"/>
         </w:numPr>
       </w:pPr>
-      <w:proofErr w:type="spellStart"/>
-      <w:r>
-        <w:t>ollama</w:t>
-      </w:r>
-      <w:proofErr w:type="spellEnd"/>
-      <w:r>
-        <w:t>/llama3</w:t>
+      <w:r>
+        <w:t>ollama/llama3</w:t>
       </w:r>
     </w:p>
     <w:p>
@@ -459,53 +329,8 @@
       </w:r>
     </w:p>
     <w:p>
-      <w:proofErr w:type="gramStart"/>
-      <w:r>
-        <w:t>{{ $</w:t>
-      </w:r>
-      <w:proofErr w:type="spellStart"/>
-      <w:r>
-        <w:t>json.task</w:t>
-      </w:r>
-      <w:proofErr w:type="gramEnd"/>
-      <w:r>
-        <w:t>_complexity</w:t>
-      </w:r>
-      <w:proofErr w:type="spellEnd"/>
-      <w:r>
-        <w:t xml:space="preserve"> == 'high</w:t>
-      </w:r>
-      <w:proofErr w:type="gramStart"/>
-      <w:r>
-        <w:t>' ?</w:t>
-      </w:r>
-      <w:proofErr w:type="gramEnd"/>
-      <w:r>
-        <w:t xml:space="preserve"> 'gpt4o</w:t>
-      </w:r>
-      <w:proofErr w:type="gramStart"/>
-      <w:r>
-        <w:t>' :</w:t>
-      </w:r>
-      <w:proofErr w:type="gramEnd"/>
-      <w:r>
-        <w:t xml:space="preserve"> '</w:t>
-      </w:r>
-      <w:proofErr w:type="spellStart"/>
-      <w:r>
-        <w:t>groq</w:t>
-      </w:r>
-      <w:proofErr w:type="spellEnd"/>
-      <w:r>
-        <w:t>/llama-3.3-70b-versatile</w:t>
-      </w:r>
-      <w:proofErr w:type="gramStart"/>
-      <w:r>
-        <w:t>' }</w:t>
-      </w:r>
-      <w:proofErr w:type="gramEnd"/>
-      <w:r>
-        <w:t>}</w:t>
+      <w:r>
+        <w:t>{{ $json.task_complexity == 'high' ? 'gpt4o' : 'groq/llama-3.3-70b-versatile' }}</w:t>
       </w:r>
     </w:p>
     <w:p>
@@ -517,47 +342,7 @@
         <w:t>What this does:</w:t>
       </w:r>
       <w:r>
-        <w:t xml:space="preserve"> If n8n determines the task is complex, it passes gpt4o to </w:t>
-      </w:r>
-      <w:proofErr w:type="spellStart"/>
-      <w:r>
-        <w:t>LiteLLM</w:t>
-      </w:r>
-      <w:proofErr w:type="spellEnd"/>
-      <w:r>
-        <w:t xml:space="preserve">. </w:t>
-      </w:r>
-      <w:proofErr w:type="spellStart"/>
-      <w:r>
-        <w:t>LiteLLM</w:t>
-      </w:r>
-      <w:proofErr w:type="spellEnd"/>
-      <w:r>
-        <w:t xml:space="preserve"> intercepts it, grabs your OPENAI_API_KEY, and routes it to OpenAI. If the task is simple, n8n passes </w:t>
-      </w:r>
-      <w:proofErr w:type="spellStart"/>
-      <w:r>
-        <w:t>groq</w:t>
-      </w:r>
-      <w:proofErr w:type="spellEnd"/>
-      <w:r>
-        <w:t xml:space="preserve">/llama-3.3-70b-versatile. </w:t>
-      </w:r>
-      <w:proofErr w:type="spellStart"/>
-      <w:r>
-        <w:t>LiteLLM</w:t>
-      </w:r>
-      <w:proofErr w:type="spellEnd"/>
-      <w:r>
-        <w:t xml:space="preserve"> intercepts it, grabs your GROQ_API_KEY, and routes it to </w:t>
-      </w:r>
-      <w:proofErr w:type="spellStart"/>
-      <w:r>
-        <w:t>Groq</w:t>
-      </w:r>
-      <w:proofErr w:type="spellEnd"/>
-      <w:r>
-        <w:t>.</w:t>
+        <w:t xml:space="preserve"> If n8n determines the task is complex, it passes gpt4o to LiteLLM. LiteLLM intercepts it, grabs your OPENAI_API_KEY, and routes it to OpenAI. If the task is simple, n8n passes groq/llama-3.3-70b-versatile. LiteLLM intercepts it, grabs your GROQ_API_KEY, and routes it to Groq.</w:t>
       </w:r>
     </w:p>
     <w:p>
@@ -566,6 +351,89 @@
       </w:r>
     </w:p>
     <w:p/>
+    <w:p/>
+    <w:p>
+      <w:pPr>
+        <w:pStyle w:val="Heading2"/>
+      </w:pPr>
+      <w:r>
+        <w:t>Question 2</w:t>
+      </w:r>
+    </w:p>
+    <w:p>
+      <w:pPr>
+        <w:rPr>
+          <w:rStyle w:val="IntenseEmphasis"/>
+        </w:rPr>
+      </w:pPr>
+      <w:r>
+        <w:rPr>
+          <w:rStyle w:val="IntenseEmphasis"/>
+        </w:rPr>
+        <w:t>How can we use LiteLLM from a subscription based N8N (assuming no VPN)? This is given that, SaaS N8N cannot reach my laptop (localhost).</w:t>
+      </w:r>
+    </w:p>
+    <w:p>
+      <w:r>
+        <w:t>Well, short answer is deploy LiteLLM in cloud, or Google COLAB, or Github-Codespace.</w:t>
+      </w:r>
+    </w:p>
+    <w:p>
+      <w:r>
+        <w:t xml:space="preserve">Option 1: Github Copilot: </w:t>
+      </w:r>
+    </w:p>
+    <w:p>
+      <w:pPr>
+        <w:pStyle w:val="ListParagraph"/>
+        <w:numPr>
+          <w:ilvl w:val="1"/>
+          <w:numId w:val="2"/>
+        </w:numPr>
+      </w:pPr>
+      <w:hyperlink r:id="rId5" w:history="1">
+        <w:r>
+          <w:rPr>
+            <w:rStyle w:val="Hyperlink"/>
+          </w:rPr>
+          <w:t>https://docs.litellm.ai/docs/tutorials/github_copilot_integration</w:t>
+        </w:r>
+      </w:hyperlink>
+    </w:p>
+    <w:p>
+      <w:pPr>
+        <w:pStyle w:val="ListParagraph"/>
+        <w:numPr>
+          <w:ilvl w:val="1"/>
+          <w:numId w:val="2"/>
+        </w:numPr>
+      </w:pPr>
+      <w:hyperlink r:id="rId6" w:history="1">
+        <w:r>
+          <w:rPr>
+            <w:rStyle w:val="Hyperlink"/>
+          </w:rPr>
+          <w:t>https://dev.to/spino327/calling-github-copilot-models-from-openhands-using-litellm-proxy-1hl4</w:t>
+        </w:r>
+      </w:hyperlink>
+      <w:r>
+        <w:t xml:space="preserve"> </w:t>
+      </w:r>
+    </w:p>
+    <w:p>
+      <w:r>
+        <w:t xml:space="preserve">Option 2: Github codespace: </w:t>
+      </w:r>
+    </w:p>
+    <w:p>
+      <w:pPr>
+        <w:pStyle w:val="ListParagraph"/>
+        <w:numPr>
+          <w:ilvl w:val="1"/>
+          <w:numId w:val="2"/>
+        </w:numPr>
+      </w:pPr>
+    </w:p>
     <w:sectPr>
       <w:pgSz w:w="11906" w:h="16838"/>
       <w:pgMar w:top="1440" w:right="1440" w:bottom="1440" w:left="1440" w:header="708" w:footer="708" w:gutter="0"/>
@@ -577,11 +445,11 @@
 </file>
 
 <file path=word/numbering.xml><?xml version="1.0" encoding="utf-8"?>
-<w:numbering xmlns:wpc="http://schemas.microsoft.com/office/word/2010/wordprocessingCanvas" xmlns:cx="http://schemas.microsoft.com/office/drawing/2014/chartex" xmlns:cx1="http://schemas.microsoft.com/office/drawing/2015/9/8/chartex" xmlns:cx2="http://schemas.microsoft.com/office/drawing/2015/10/21/chartex" xmlns:cx3="http://schemas.microsoft.com/office/drawing/2016/5/9/chartex" xmlns:cx4="http://schemas.microsoft.com/office/drawing/2016/5/10/chartex" xmlns:cx5="http://schemas.microsoft.com/office/drawing/2016/5/11/chartex" xmlns:cx6="http://schemas.microsoft.com/office/drawing/2016/5/12/chartex" xmlns:cx7="http://schemas.microsoft.com/office/drawing/2016/5/13/chartex" xmlns:cx8="http://schemas.microsoft.com/office/drawing/2016/5/14/chartex" xmlns:mc="http://schemas.openxmlformats.org/markup-compatibility/2006" xmlns:aink="http://schemas.microsoft.com/office/drawing/2016/ink" xmlns:am3d="http://schemas.microsoft.com/office/drawing/2017/model3d" xmlns:o="urn:schemas-microsoft-com:office:office" xmlns:oel="http://schemas.microsoft.com/office/2019/extlst" xmlns:r="http://schemas.openxmlformats.org/officeDocument/2006/relationships" xmlns:m="http://schemas.openxmlformats.org/officeDocument/2006/math" xmlns:v="urn:schemas-microsoft-com:vml" xmlns:wp14="http://schemas.microsoft.com/office/word/2010/wordprocessingDrawing" xmlns:wp="http://schemas.openxmlformats.org/drawingml/2006/wordprocessingDrawing" xmlns:w10="urn:schemas-microsoft-com:office:word" xmlns:w="http://schemas.openxmlformats.org/wordprocessingml/2006/main" xmlns:w14="http://schemas.microsoft.com/office/word/2010/wordml" xmlns:w15="http://schemas.microsoft.com/office/word/2012/wordml" xmlns:w16cex="http://schemas.microsoft.com/office/word/2018/wordml/cex" xmlns:w16cid="http://schemas.microsoft.com/office/word/2016/wordml/cid" xmlns:w16="http://schemas.microsoft.com/office/word/2018/wordml" xmlns:w16du="http://schemas.microsoft.com/office/word/2023/wordml/word16du" xmlns:w16sdtdh="http://schemas.microsoft.com/office/word/2020/wordml/sdtdatahash" xmlns:w16sdtfl="http://schemas.microsoft.com/office/word/2024/wordml/sdtformatlock" xmlns:w16se="http://schemas.microsoft.com/office/word/2015/wordml/symex" xmlns:wpg="http://schemas.microsoft.com/office/word/2010/wordprocessingGroup" xmlns:wpi="http://schemas.microsoft.com/office/word/2010/wordprocessingInk" xmlns:wne="http://schemas.microsoft.com/office/word/2006/wordml" xmlns:wps="http://schemas.microsoft.com/office/word/2010/wordprocessingShape" mc:Ignorable="w14 w15 w16se w16cid w16 w16cex w16sdtdh w16sdtfl w16du wp14">
+<w:numbering xmlns:wpc="http://schemas.microsoft.com/office/word/2010/wordprocessingCanvas" xmlns:cx="http://schemas.microsoft.com/office/drawing/2014/chartex" xmlns:cx1="http://schemas.microsoft.com/office/drawing/2015/9/8/chartex" xmlns:cx2="http://schemas.microsoft.com/office/drawing/2015/10/21/chartex" xmlns:cx3="http://schemas.microsoft.com/office/drawing/2016/5/9/chartex" xmlns:cx4="http://schemas.microsoft.com/office/drawing/2016/5/10/chartex" xmlns:cx5="http://schemas.microsoft.com/office/drawing/2016/5/11/chartex" xmlns:cx6="http://schemas.microsoft.com/office/drawing/2016/5/12/chartex" xmlns:cx7="http://schemas.microsoft.com/office/drawing/2016/5/13/chartex" xmlns:cx8="http://schemas.microsoft.com/office/drawing/2016/5/14/chartex" xmlns:mc="http://schemas.openxmlformats.org/markup-compatibility/2006" xmlns:aink="http://schemas.microsoft.com/office/drawing/2016/ink" xmlns:am3d="http://schemas.microsoft.com/office/drawing/2017/model3d" xmlns:o="urn:schemas-microsoft-com:office:office" xmlns:oel="http://schemas.microsoft.com/office/2019/extlst" xmlns:r="http://schemas.openxmlformats.org/officeDocument/2006/relationships" xmlns:m="http://schemas.openxmlformats.org/officeDocument/2006/math" xmlns:v="urn:schemas-microsoft-com:vml" xmlns:wp14="http://schemas.microsoft.com/office/word/2010/wordprocessingDrawing" xmlns:wp="http://schemas.openxmlformats.org/drawingml/2006/wordprocessingDrawing" xmlns:w10="urn:schemas-microsoft-com:office:word" xmlns:w="http://schemas.openxmlformats.org/wordprocessingml/2006/main" xmlns:w14="http://schemas.microsoft.com/office/word/2010/wordml" xmlns:w15="http://schemas.microsoft.com/office/word/2012/wordml" xmlns:w16cei="http://schemas.microsoft.com/office/word/2026/wordml/cei" xmlns:w16cex="http://schemas.microsoft.com/office/word/2018/wordml/cex" xmlns:w16cid="http://schemas.microsoft.com/office/word/2016/wordml/cid" xmlns:w16="http://schemas.microsoft.com/office/word/2018/wordml" xmlns:w16du="http://schemas.microsoft.com/office/word/2023/wordml/word16du" xmlns:w16sdtdh="http://schemas.microsoft.com/office/word/2020/wordml/sdtdatahash" xmlns:w16sdtfl="http://schemas.microsoft.com/office/word/2024/wordml/sdtformatlock" xmlns:w16se="http://schemas.microsoft.com/office/word/2015/wordml/symex" xmlns:wpg="http://schemas.microsoft.com/office/word/2010/wordprocessingGroup" xmlns:wpi="http://schemas.microsoft.com/office/word/2010/wordprocessingInk" xmlns:wne="http://schemas.microsoft.com/office/word/2006/wordml" xmlns:wps="http://schemas.microsoft.com/office/word/2010/wordprocessingShape" mc:Ignorable="w14 w15 w16se w16cid w16 w16cex w16sdtdh w16sdtfl w16du wp14">
   <w:abstractNum w:abstractNumId="0" w15:restartNumberingAfterBreak="0">
     <w:nsid w:val="0C2D5185"/>
     <w:multiLevelType w:val="multilevel"/>
-    <w:tmpl w:val="59AA2914"/>
+    <w:tmpl w:val="F92CA942"/>
     <w:lvl w:ilvl="0">
       <w:start w:val="1"/>
       <w:numFmt w:val="decimal"/>
@@ -594,17 +462,16 @@
         <w:ind w:left="720" w:hanging="360"/>
       </w:pPr>
     </w:lvl>
-    <w:lvl w:ilvl="1" w:tentative="1">
-      <w:start w:val="1"/>
-      <w:numFmt w:val="decimal"/>
-      <w:lvlText w:val="%2."/>
-      <w:lvlJc w:val="left"/>
-      <w:pPr>
-        <w:tabs>
-          <w:tab w:val="num" w:pos="1440"/>
-        </w:tabs>
+    <w:lvl w:ilvl="1">
+      <w:numFmt w:val="bullet"/>
+      <w:lvlText w:val="-"/>
+      <w:lvlJc w:val="left"/>
+      <w:pPr>
         <w:ind w:left="1440" w:hanging="360"/>
       </w:pPr>
+      <w:rPr>
+        <w:rFonts w:ascii="Calibri" w:eastAsiaTheme="minorHAnsi" w:hAnsi="Calibri" w:cs="Calibri" w:hint="default"/>
+      </w:rPr>
     </w:lvl>
     <w:lvl w:ilvl="2" w:tentative="1">
       <w:start w:val="1"/>
@@ -1567,6 +1434,7 @@
   <w:style w:type="character" w:default="1" w:styleId="DefaultParagraphFont">
     <w:name w:val="Default Paragraph Font"/>
     <w:uiPriority w:val="1"/>
+    <w:semiHidden/>
     <w:unhideWhenUsed/>
   </w:style>
   <w:style w:type="table" w:default="1" w:styleId="TableNormal">
@@ -1877,6 +1745,29 @@
       <w:smallCaps/>
       <w:color w:val="2F5496" w:themeColor="accent1" w:themeShade="BF"/>
       <w:spacing w:val="5"/>
+    </w:rPr>
+  </w:style>
+  <w:style w:type="character" w:styleId="Hyperlink">
+    <w:name w:val="Hyperlink"/>
+    <w:basedOn w:val="DefaultParagraphFont"/>
+    <w:uiPriority w:val="99"/>
+    <w:unhideWhenUsed/>
+    <w:rsid w:val="00DA5E31"/>
+    <w:rPr>
+      <w:color w:val="0563C1" w:themeColor="hyperlink"/>
+      <w:u w:val="single"/>
+    </w:rPr>
+  </w:style>
+  <w:style w:type="character" w:styleId="UnresolvedMention">
+    <w:name w:val="Unresolved Mention"/>
+    <w:basedOn w:val="DefaultParagraphFont"/>
+    <w:uiPriority w:val="99"/>
+    <w:semiHidden/>
+    <w:unhideWhenUsed/>
+    <w:rsid w:val="00DA5E31"/>
+    <w:rPr>
+      <w:color w:val="605E5C"/>
+      <w:shd w:val="clear" w:color="auto" w:fill="E1DFDD"/>
     </w:rPr>
   </w:style>
 </w:styles>

</xml_diff>